<commit_message>
boundary layer and metadata update
</commit_message>
<xml_diff>
--- a/Methods/Bays_Bayous_Lakes Boundary Layer Meta Data.docx
+++ b/Methods/Bays_Bayous_Lakes Boundary Layer Meta Data.docx
@@ -21,9 +21,14 @@
       </w:r>
       <w:proofErr w:type="spellStart"/>
       <w:r>
-        <w:t>Bays_Bayous_Lakes</w:t>
+        <w:t>Bays_Bayous_</w:t>
+      </w:r>
+      <w:proofErr w:type="gramStart"/>
+      <w:r>
+        <w:t>Lakes</w:t>
       </w:r>
       <w:proofErr w:type="spellEnd"/>
+      <w:proofErr w:type="gramEnd"/>
       <w:r>
         <w:t xml:space="preserve"> boundary layer was created by combining </w:t>
       </w:r>
@@ -92,7 +97,7 @@
       </w:r>
     </w:p>
     <w:p>
-      <w:hyperlink r:id="rId4" w:history="1">
+      <w:hyperlink r:id="rId5" w:history="1">
         <w:r>
           <w:rPr>
             <w:rStyle w:val="Hyperlink"/>
@@ -137,7 +142,7 @@
       </w:r>
     </w:p>
     <w:p>
-      <w:hyperlink r:id="rId5" w:history="1">
+      <w:hyperlink r:id="rId6" w:history="1">
         <w:r>
           <w:rPr>
             <w:rStyle w:val="Hyperlink"/>
@@ -155,7 +160,7 @@
       </w:r>
     </w:p>
     <w:p>
-      <w:hyperlink r:id="rId6" w:history="1">
+      <w:hyperlink r:id="rId7" w:history="1">
         <w:r>
           <w:rPr>
             <w:rStyle w:val="Hyperlink"/>
@@ -188,7 +193,7 @@
       </w:r>
     </w:p>
     <w:p>
-      <w:hyperlink r:id="rId7" w:history="1">
+      <w:hyperlink r:id="rId8" w:history="1">
         <w:r>
           <w:rPr>
             <w:rStyle w:val="Hyperlink"/>
@@ -206,7 +211,7 @@
       </w:r>
     </w:p>
     <w:p>
-      <w:hyperlink r:id="rId8" w:history="1">
+      <w:hyperlink r:id="rId9" w:history="1">
         <w:r>
           <w:rPr>
             <w:rStyle w:val="Hyperlink"/>
@@ -217,6 +222,422 @@
       <w:r>
         <w:t xml:space="preserve"> </w:t>
       </w:r>
+    </w:p>
+    <w:p>
+      <w:pPr>
+        <w:pStyle w:val="Heading1"/>
+      </w:pPr>
+      <w:r>
+        <w:lastRenderedPageBreak/>
+        <w:t>Version History</w:t>
+      </w:r>
+    </w:p>
+    <w:p>
+      <w:pPr>
+        <w:rPr>
+          <w:b/>
+          <w:bCs/>
+        </w:rPr>
+      </w:pPr>
+      <w:r>
+        <w:rPr>
+          <w:b/>
+          <w:bCs/>
+        </w:rPr>
+        <w:t>Current Version: Bays_Bayous_Lakes_V5</w:t>
+      </w:r>
+    </w:p>
+    <w:p>
+      <w:r>
+        <w:t xml:space="preserve">The </w:t>
+      </w:r>
+      <w:proofErr w:type="spellStart"/>
+      <w:r>
+        <w:t>Bays_Bayous_</w:t>
+      </w:r>
+      <w:proofErr w:type="gramStart"/>
+      <w:r>
+        <w:t>Lakes</w:t>
+      </w:r>
+      <w:proofErr w:type="spellEnd"/>
+      <w:proofErr w:type="gramEnd"/>
+      <w:r>
+        <w:t xml:space="preserve"> boundary layer has undergone several revisions </w:t>
+      </w:r>
+      <w:proofErr w:type="gramStart"/>
+      <w:r>
+        <w:t>in order to</w:t>
+      </w:r>
+      <w:proofErr w:type="gramEnd"/>
+      <w:r>
+        <w:t xml:space="preserve"> refine the boundaries between </w:t>
+      </w:r>
+      <w:r>
+        <w:t>bayous and main waterbody segments, clarify duplicate names, and address other concerns. The current version (V5) was updated from V4</w:t>
+      </w:r>
+      <w:r>
+        <w:t xml:space="preserve"> with the following changes: </w:t>
+      </w:r>
+    </w:p>
+    <w:p>
+      <w:pPr>
+        <w:pStyle w:val="ListParagraph"/>
+        <w:numPr>
+          <w:ilvl w:val="0"/>
+          <w:numId w:val="1"/>
+        </w:numPr>
+      </w:pPr>
+      <w:r>
+        <w:t xml:space="preserve">Duplicate </w:t>
+      </w:r>
+      <w:proofErr w:type="spellStart"/>
+      <w:r>
+        <w:t>Sheephead</w:t>
+      </w:r>
+      <w:proofErr w:type="spellEnd"/>
+      <w:r>
+        <w:t xml:space="preserve"> Bayous were found in </w:t>
+      </w:r>
+      <w:proofErr w:type="gramStart"/>
+      <w:r>
+        <w:t>North bay</w:t>
+      </w:r>
+      <w:proofErr w:type="gramEnd"/>
+      <w:r>
+        <w:t xml:space="preserve"> and East Bay. </w:t>
+      </w:r>
+      <w:r>
+        <w:t>The bayou in East Bay and renamed “</w:t>
+      </w:r>
+      <w:proofErr w:type="spellStart"/>
+      <w:r>
+        <w:t>SheepheadBayou_EastBay</w:t>
+      </w:r>
+      <w:proofErr w:type="spellEnd"/>
+      <w:r>
+        <w:t xml:space="preserve">” </w:t>
+      </w:r>
+    </w:p>
+    <w:p>
+      <w:pPr>
+        <w:pStyle w:val="ListParagraph"/>
+        <w:numPr>
+          <w:ilvl w:val="0"/>
+          <w:numId w:val="1"/>
+        </w:numPr>
+      </w:pPr>
+      <w:r>
+        <w:t>A distinct polygon was created for Parker Bayou</w:t>
+      </w:r>
+      <w:r>
+        <w:t xml:space="preserve"> in East Bay. Within/</w:t>
+      </w:r>
+      <w:proofErr w:type="spellStart"/>
+      <w:r>
+        <w:t>adjact</w:t>
+      </w:r>
+      <w:proofErr w:type="spellEnd"/>
+      <w:r>
+        <w:t xml:space="preserve"> to Parker Bayou, a polygon was created for Pratt Bayou</w:t>
+      </w:r>
+      <w:r>
+        <w:t xml:space="preserve">. </w:t>
+      </w:r>
+    </w:p>
+    <w:p>
+      <w:pPr>
+        <w:pStyle w:val="ListParagraph"/>
+        <w:numPr>
+          <w:ilvl w:val="0"/>
+          <w:numId w:val="1"/>
+        </w:numPr>
+      </w:pPr>
+      <w:r>
+        <w:t>Duplicate Johnson Bayous were found, and the Johnson Bayou located in West Bay was renamed “</w:t>
+      </w:r>
+      <w:proofErr w:type="spellStart"/>
+      <w:r>
+        <w:t>JohnsonBayou_WestBay</w:t>
+      </w:r>
+      <w:proofErr w:type="spellEnd"/>
+      <w:r>
+        <w:t>”</w:t>
+      </w:r>
+    </w:p>
+    <w:p>
+      <w:pPr>
+        <w:pStyle w:val="ListParagraph"/>
+        <w:numPr>
+          <w:ilvl w:val="0"/>
+          <w:numId w:val="1"/>
+        </w:numPr>
+      </w:pPr>
+      <w:r>
+        <w:t xml:space="preserve">The small bayou in the northeast North Bay just before </w:t>
+      </w:r>
+      <w:r>
+        <w:t>Deer Point Lake and next to the Lynn Haven Bayou Park and Preserve</w:t>
+      </w:r>
+      <w:r>
+        <w:t xml:space="preserve"> was separated from North Bay and identified as </w:t>
+      </w:r>
+      <w:proofErr w:type="spellStart"/>
+      <w:r>
+        <w:t>McKitchens</w:t>
+      </w:r>
+      <w:proofErr w:type="spellEnd"/>
+      <w:r>
+        <w:t xml:space="preserve"> Bayou.</w:t>
+      </w:r>
+    </w:p>
+    <w:p>
+      <w:pPr>
+        <w:pStyle w:val="ListParagraph"/>
+        <w:numPr>
+          <w:ilvl w:val="0"/>
+          <w:numId w:val="1"/>
+        </w:numPr>
+      </w:pPr>
+      <w:r>
+        <w:t xml:space="preserve">Mill Bayou was merged into a single polygon </w:t>
+      </w:r>
+    </w:p>
+    <w:p>
+      <w:pPr>
+        <w:pStyle w:val="ListParagraph"/>
+        <w:numPr>
+          <w:ilvl w:val="0"/>
+          <w:numId w:val="1"/>
+        </w:numPr>
+      </w:pPr>
+      <w:r>
+        <w:t xml:space="preserve">Portions of North Bay that </w:t>
+      </w:r>
+      <w:proofErr w:type="gramStart"/>
+      <w:r>
+        <w:t>overlayed</w:t>
+      </w:r>
+      <w:proofErr w:type="gramEnd"/>
+      <w:r>
+        <w:t xml:space="preserve"> </w:t>
+      </w:r>
+      <w:r>
+        <w:t xml:space="preserve">Beatty Bayou were deleted and Beatty Bayou was edited to be its own polygon. </w:t>
+      </w:r>
+    </w:p>
+    <w:p>
+      <w:pPr>
+        <w:pStyle w:val="ListParagraph"/>
+        <w:numPr>
+          <w:ilvl w:val="0"/>
+          <w:numId w:val="1"/>
+        </w:numPr>
+      </w:pPr>
+      <w:r>
+        <w:t>Robinson Bayou was connected to St. Andrew Bay</w:t>
+      </w:r>
+    </w:p>
+    <w:p>
+      <w:pPr>
+        <w:pStyle w:val="ListParagraph"/>
+        <w:numPr>
+          <w:ilvl w:val="0"/>
+          <w:numId w:val="1"/>
+        </w:numPr>
+      </w:pPr>
+      <w:r>
+        <w:t>The main St. Andrew Bay polygon was edited to account for Audubon Island</w:t>
+      </w:r>
+    </w:p>
+    <w:p>
+      <w:pPr>
+        <w:pStyle w:val="ListParagraph"/>
+        <w:numPr>
+          <w:ilvl w:val="0"/>
+          <w:numId w:val="1"/>
+        </w:numPr>
+      </w:pPr>
+      <w:r>
+        <w:t>The border between St. Andrew Bay and East Bay was edited to match the boundaries outlined by the Numeric Nutrient Criterion</w:t>
+      </w:r>
+      <w:r>
+        <w:t xml:space="preserve">, and as a result </w:t>
+      </w:r>
+      <w:proofErr w:type="spellStart"/>
+      <w:r>
+        <w:t>Massalina</w:t>
+      </w:r>
+      <w:proofErr w:type="spellEnd"/>
+      <w:r>
+        <w:t xml:space="preserve"> Bayou was reassigned a major segment of St. Andrew Bay</w:t>
+      </w:r>
+    </w:p>
+    <w:p>
+      <w:pPr>
+        <w:pStyle w:val="ListParagraph"/>
+        <w:numPr>
+          <w:ilvl w:val="0"/>
+          <w:numId w:val="1"/>
+        </w:numPr>
+      </w:pPr>
+      <w:r>
+        <w:t>Bunkers Cove along the shoreline by the St. Andrew Yacht Club was removed and the East Bay boundary was expanded to take its place</w:t>
+      </w:r>
+    </w:p>
+    <w:p>
+      <w:pPr>
+        <w:pStyle w:val="ListParagraph"/>
+        <w:numPr>
+          <w:ilvl w:val="0"/>
+          <w:numId w:val="1"/>
+        </w:numPr>
+      </w:pPr>
+      <w:r>
+        <w:t>Lake Clair was separated from the main East Bay boundary</w:t>
+      </w:r>
+    </w:p>
+    <w:p>
+      <w:pPr>
+        <w:pStyle w:val="ListParagraph"/>
+        <w:numPr>
+          <w:ilvl w:val="0"/>
+          <w:numId w:val="1"/>
+        </w:numPr>
+      </w:pPr>
+      <w:r>
+        <w:t xml:space="preserve">Slivers of the East Bay boundary were removed from the </w:t>
+      </w:r>
+      <w:r>
+        <w:t>Intracoastal Waterway</w:t>
+      </w:r>
+    </w:p>
+    <w:p>
+      <w:pPr>
+        <w:pStyle w:val="ListParagraph"/>
+        <w:numPr>
+          <w:ilvl w:val="0"/>
+          <w:numId w:val="1"/>
+        </w:numPr>
+      </w:pPr>
+      <w:r>
+        <w:t xml:space="preserve">Lannie Row was renamed Suddeth Pond to match </w:t>
+      </w:r>
+      <w:r>
+        <w:t>the name listed in the satellite imagery. The major segment was re-listed as Lake instead of East Bay</w:t>
+      </w:r>
+    </w:p>
+    <w:p>
+      <w:pPr>
+        <w:pStyle w:val="ListParagraph"/>
+        <w:numPr>
+          <w:ilvl w:val="0"/>
+          <w:numId w:val="1"/>
+        </w:numPr>
+      </w:pPr>
+      <w:r>
+        <w:t xml:space="preserve">Segments of East Bay were removed from the following </w:t>
+      </w:r>
+      <w:proofErr w:type="gramStart"/>
+      <w:r>
+        <w:t>bayous</w:t>
+      </w:r>
+      <w:proofErr w:type="gramEnd"/>
+      <w:r>
+        <w:t xml:space="preserve"> and new complete bayou polygons were completed</w:t>
+      </w:r>
+    </w:p>
+    <w:p>
+      <w:pPr>
+        <w:pStyle w:val="ListParagraph"/>
+        <w:numPr>
+          <w:ilvl w:val="1"/>
+          <w:numId w:val="1"/>
+        </w:numPr>
+      </w:pPr>
+      <w:r>
+        <w:t>Dolon Bayou</w:t>
+      </w:r>
+    </w:p>
+    <w:p>
+      <w:pPr>
+        <w:pStyle w:val="ListParagraph"/>
+        <w:numPr>
+          <w:ilvl w:val="1"/>
+          <w:numId w:val="1"/>
+        </w:numPr>
+      </w:pPr>
+      <w:r>
+        <w:t>Higgs Bayou</w:t>
+      </w:r>
+    </w:p>
+    <w:p>
+      <w:pPr>
+        <w:pStyle w:val="ListParagraph"/>
+        <w:numPr>
+          <w:ilvl w:val="1"/>
+          <w:numId w:val="1"/>
+        </w:numPr>
+      </w:pPr>
+      <w:r>
+        <w:t>Smith Bayou</w:t>
+      </w:r>
+    </w:p>
+    <w:p>
+      <w:pPr>
+        <w:pStyle w:val="ListParagraph"/>
+        <w:numPr>
+          <w:ilvl w:val="1"/>
+          <w:numId w:val="1"/>
+        </w:numPr>
+      </w:pPr>
+      <w:r>
+        <w:t>Bur</w:t>
+      </w:r>
+      <w:r>
+        <w:t>kett Bayou</w:t>
+      </w:r>
+    </w:p>
+    <w:p>
+      <w:pPr>
+        <w:pStyle w:val="ListParagraph"/>
+        <w:numPr>
+          <w:ilvl w:val="1"/>
+          <w:numId w:val="1"/>
+        </w:numPr>
+      </w:pPr>
+      <w:r>
+        <w:t>Murray Bayou</w:t>
+      </w:r>
+    </w:p>
+    <w:p>
+      <w:pPr>
+        <w:pStyle w:val="ListParagraph"/>
+        <w:numPr>
+          <w:ilvl w:val="1"/>
+          <w:numId w:val="1"/>
+        </w:numPr>
+      </w:pPr>
+      <w:r>
+        <w:lastRenderedPageBreak/>
+        <w:t>Little Blue Lake</w:t>
+      </w:r>
+    </w:p>
+    <w:p>
+      <w:pPr>
+        <w:pStyle w:val="ListParagraph"/>
+        <w:numPr>
+          <w:ilvl w:val="1"/>
+          <w:numId w:val="1"/>
+        </w:numPr>
+      </w:pPr>
+      <w:r>
+        <w:t>Auburn Cove</w:t>
+      </w:r>
+    </w:p>
+    <w:p>
+      <w:pPr>
+        <w:pStyle w:val="ListParagraph"/>
+      </w:pPr>
     </w:p>
     <w:p/>
     <w:p/>
@@ -228,6 +649,103 @@
     </w:sectPr>
   </w:body>
 </w:document>
+</file>
+
+<file path=word/numbering.xml><?xml version="1.0" encoding="utf-8"?>
+<w:numbering xmlns:wpc="http://schemas.microsoft.com/office/word/2010/wordprocessingCanvas" xmlns:cx="http://schemas.microsoft.com/office/drawing/2014/chartex" xmlns:cx1="http://schemas.microsoft.com/office/drawing/2015/9/8/chartex" xmlns:cx2="http://schemas.microsoft.com/office/drawing/2015/10/21/chartex" xmlns:cx3="http://schemas.microsoft.com/office/drawing/2016/5/9/chartex" xmlns:cx4="http://schemas.microsoft.com/office/drawing/2016/5/10/chartex" xmlns:cx5="http://schemas.microsoft.com/office/drawing/2016/5/11/chartex" xmlns:cx6="http://schemas.microsoft.com/office/drawing/2016/5/12/chartex" xmlns:cx7="http://schemas.microsoft.com/office/drawing/2016/5/13/chartex" xmlns:cx8="http://schemas.microsoft.com/office/drawing/2016/5/14/chartex" xmlns:mc="http://schemas.openxmlformats.org/markup-compatibility/2006" xmlns:aink="http://schemas.microsoft.com/office/drawing/2016/ink" xmlns:am3d="http://schemas.microsoft.com/office/drawing/2017/model3d" xmlns:o="urn:schemas-microsoft-com:office:office" xmlns:oel="http://schemas.microsoft.com/office/2019/extlst" xmlns:r="http://schemas.openxmlformats.org/officeDocument/2006/relationships" xmlns:m="http://schemas.openxmlformats.org/officeDocument/2006/math" xmlns:v="urn:schemas-microsoft-com:vml" xmlns:wp14="http://schemas.microsoft.com/office/word/2010/wordprocessingDrawing" xmlns:wp="http://schemas.openxmlformats.org/drawingml/2006/wordprocessingDrawing" xmlns:w10="urn:schemas-microsoft-com:office:word" xmlns:w="http://schemas.openxmlformats.org/wordprocessingml/2006/main" xmlns:w14="http://schemas.microsoft.com/office/word/2010/wordml" xmlns:w15="http://schemas.microsoft.com/office/word/2012/wordml" xmlns:w16cex="http://schemas.microsoft.com/office/word/2018/wordml/cex" xmlns:w16cid="http://schemas.microsoft.com/office/word/2016/wordml/cid" xmlns:w16="http://schemas.microsoft.com/office/word/2018/wordml" xmlns:w16du="http://schemas.microsoft.com/office/word/2023/wordml/word16du" xmlns:w16sdtdh="http://schemas.microsoft.com/office/word/2020/wordml/sdtdatahash" xmlns:w16sdtfl="http://schemas.microsoft.com/office/word/2024/wordml/sdtformatlock" xmlns:w16se="http://schemas.microsoft.com/office/word/2015/wordml/symex" xmlns:wpg="http://schemas.microsoft.com/office/word/2010/wordprocessingGroup" xmlns:wpi="http://schemas.microsoft.com/office/word/2010/wordprocessingInk" xmlns:wne="http://schemas.microsoft.com/office/word/2006/wordml" xmlns:wps="http://schemas.microsoft.com/office/word/2010/wordprocessingShape" mc:Ignorable="w14 w15 w16se w16cid w16 w16cex w16sdtdh w16sdtfl w16du wp14">
+  <w:abstractNum w:abstractNumId="0" w15:restartNumberingAfterBreak="0">
+    <w:nsid w:val="53832225"/>
+    <w:multiLevelType w:val="hybridMultilevel"/>
+    <w:tmpl w:val="E1F4E7AC"/>
+    <w:lvl w:ilvl="0" w:tplc="0409000F">
+      <w:start w:val="1"/>
+      <w:numFmt w:val="decimal"/>
+      <w:lvlText w:val="%1."/>
+      <w:lvlJc w:val="left"/>
+      <w:pPr>
+        <w:ind w:left="720" w:hanging="360"/>
+      </w:pPr>
+      <w:rPr>
+        <w:rFonts w:hint="default"/>
+      </w:rPr>
+    </w:lvl>
+    <w:lvl w:ilvl="1" w:tplc="04090019">
+      <w:start w:val="1"/>
+      <w:numFmt w:val="lowerLetter"/>
+      <w:lvlText w:val="%2."/>
+      <w:lvlJc w:val="left"/>
+      <w:pPr>
+        <w:ind w:left="1440" w:hanging="360"/>
+      </w:pPr>
+    </w:lvl>
+    <w:lvl w:ilvl="2" w:tplc="0409001B" w:tentative="1">
+      <w:start w:val="1"/>
+      <w:numFmt w:val="lowerRoman"/>
+      <w:lvlText w:val="%3."/>
+      <w:lvlJc w:val="right"/>
+      <w:pPr>
+        <w:ind w:left="2160" w:hanging="180"/>
+      </w:pPr>
+    </w:lvl>
+    <w:lvl w:ilvl="3" w:tplc="0409000F" w:tentative="1">
+      <w:start w:val="1"/>
+      <w:numFmt w:val="decimal"/>
+      <w:lvlText w:val="%4."/>
+      <w:lvlJc w:val="left"/>
+      <w:pPr>
+        <w:ind w:left="2880" w:hanging="360"/>
+      </w:pPr>
+    </w:lvl>
+    <w:lvl w:ilvl="4" w:tplc="04090019" w:tentative="1">
+      <w:start w:val="1"/>
+      <w:numFmt w:val="lowerLetter"/>
+      <w:lvlText w:val="%5."/>
+      <w:lvlJc w:val="left"/>
+      <w:pPr>
+        <w:ind w:left="3600" w:hanging="360"/>
+      </w:pPr>
+    </w:lvl>
+    <w:lvl w:ilvl="5" w:tplc="0409001B" w:tentative="1">
+      <w:start w:val="1"/>
+      <w:numFmt w:val="lowerRoman"/>
+      <w:lvlText w:val="%6."/>
+      <w:lvlJc w:val="right"/>
+      <w:pPr>
+        <w:ind w:left="4320" w:hanging="180"/>
+      </w:pPr>
+    </w:lvl>
+    <w:lvl w:ilvl="6" w:tplc="0409000F" w:tentative="1">
+      <w:start w:val="1"/>
+      <w:numFmt w:val="decimal"/>
+      <w:lvlText w:val="%7."/>
+      <w:lvlJc w:val="left"/>
+      <w:pPr>
+        <w:ind w:left="5040" w:hanging="360"/>
+      </w:pPr>
+    </w:lvl>
+    <w:lvl w:ilvl="7" w:tplc="04090019" w:tentative="1">
+      <w:start w:val="1"/>
+      <w:numFmt w:val="lowerLetter"/>
+      <w:lvlText w:val="%8."/>
+      <w:lvlJc w:val="left"/>
+      <w:pPr>
+        <w:ind w:left="5760" w:hanging="360"/>
+      </w:pPr>
+    </w:lvl>
+    <w:lvl w:ilvl="8" w:tplc="0409001B" w:tentative="1">
+      <w:start w:val="1"/>
+      <w:numFmt w:val="lowerRoman"/>
+      <w:lvlText w:val="%9."/>
+      <w:lvlJc w:val="right"/>
+      <w:pPr>
+        <w:ind w:left="6480" w:hanging="180"/>
+      </w:pPr>
+    </w:lvl>
+  </w:abstractNum>
+  <w:num w:numId="1" w16cid:durableId="130441325">
+    <w:abstractNumId w:val="0"/>
+  </w:num>
+</w:numbering>
 </file>
 
 <file path=word/styles.xml><?xml version="1.0" encoding="utf-8"?>
@@ -832,6 +1350,7 @@
   <w:style w:type="character" w:default="1" w:styleId="DefaultParagraphFont">
     <w:name w:val="Default Paragraph Font"/>
     <w:uiPriority w:val="1"/>
+    <w:semiHidden/>
     <w:unhideWhenUsed/>
   </w:style>
   <w:style w:type="table" w:default="1" w:styleId="TableNormal">

</xml_diff>

<commit_message>
Updated boundary layer overview methods
</commit_message>
<xml_diff>
--- a/Methods/Bays_Bayous_Lakes Boundary Layer Meta Data.docx
+++ b/Methods/Bays_Bayous_Lakes Boundary Layer Meta Data.docx
@@ -6,19 +6,53 @@
       <w:pPr>
         <w:pStyle w:val="Heading1"/>
       </w:pPr>
-      <w:r>
-        <w:t>Bays_Bayous_Lakes Boundary Layer Meta Data</w:t>
-      </w:r>
-    </w:p>
-    <w:p>
-      <w:r>
-        <w:t xml:space="preserve">The Bays_Bayous_Lakes boundary layer was created by combining NHDPlus HR waterbody features with FDEP Florida Lakes and NNC Estuary Nutrient Regions datasets. Features were merged, dissolved, and edited as necessary to produce a continuous polygon layer representing major bays, bayous, lakes, and estuarine waters within </w:t>
+      <w:proofErr w:type="spellStart"/>
+      <w:r>
+        <w:t>Bays_Bayous_Lakes</w:t>
+      </w:r>
+      <w:proofErr w:type="spellEnd"/>
+      <w:r>
+        <w:t xml:space="preserve"> Boundary Layer Meta Data</w:t>
+      </w:r>
+    </w:p>
+    <w:p>
+      <w:r>
+        <w:t xml:space="preserve">The </w:t>
+      </w:r>
+      <w:proofErr w:type="spellStart"/>
+      <w:r>
+        <w:t>Bays_Bayous_</w:t>
+      </w:r>
+      <w:proofErr w:type="gramStart"/>
+      <w:r>
+        <w:t>Lakes</w:t>
+      </w:r>
+      <w:proofErr w:type="spellEnd"/>
+      <w:proofErr w:type="gramEnd"/>
+      <w:r>
+        <w:t xml:space="preserve"> boundary layer was created by combining </w:t>
+      </w:r>
+      <w:proofErr w:type="spellStart"/>
+      <w:r>
+        <w:t>NHDPlus</w:t>
+      </w:r>
+      <w:proofErr w:type="spellEnd"/>
+      <w:r>
+        <w:t xml:space="preserve"> HR waterbody features with FDEP Florida Lakes and NNC Estuary Nutrient Regions datasets. Features were merged, dissolved, and edited as necessary to produce a continuous polygon layer representing major bays, bayous, lakes, and estuarine waters within </w:t>
       </w:r>
       <w:r>
         <w:t>the St. Andrew Bay Watershed</w:t>
       </w:r>
       <w:r>
-        <w:t>. The FDEP datasets were used to supplement and refine NHDPlus HR waterbody boundaries, particularly for estuarine systems and named lakes not fully represented within the base hydrography dataset.</w:t>
+        <w:t xml:space="preserve">. The FDEP datasets were used to supplement and refine </w:t>
+      </w:r>
+      <w:proofErr w:type="spellStart"/>
+      <w:r>
+        <w:t>NHDPlus</w:t>
+      </w:r>
+      <w:proofErr w:type="spellEnd"/>
+      <w:r>
+        <w:t xml:space="preserve"> HR waterbody boundaries, particularly for estuarine systems and named lakes not fully represented within the base hydrography dataset.</w:t>
       </w:r>
       <w:r>
         <w:t xml:space="preserve"> The NNC dataset was used to determine the boundaries for each segment in St. Andrew Bay</w:t>
@@ -27,7 +61,6 @@
         <w:t xml:space="preserve"> and for St. Joseph Bay. </w:t>
       </w:r>
     </w:p>
-    <w:p/>
     <w:p>
       <w:pPr>
         <w:pStyle w:val="Heading2"/>
@@ -39,13 +72,41 @@
         <w:rPr>
           <w:color w:val="auto"/>
         </w:rPr>
-        <w:t>National Hydro</w:t>
-      </w:r>
-      <w:r>
+        <w:t>NCCA layer sourced from Mike McManus</w:t>
+      </w:r>
+    </w:p>
+    <w:p>
+      <w:pPr>
+        <w:pStyle w:val="Heading2"/>
         <w:rPr>
           <w:color w:val="auto"/>
         </w:rPr>
-        <w:t>graphy Dataset Plus High Resolution (NHDPlus HR)</w:t>
+      </w:pPr>
+      <w:r>
+        <w:rPr>
+          <w:color w:val="auto"/>
+        </w:rPr>
+        <w:t>National Hydro</w:t>
+      </w:r>
+      <w:r>
+        <w:rPr>
+          <w:color w:val="auto"/>
+        </w:rPr>
+        <w:t>graphy Dataset Plus High Resolution (</w:t>
+      </w:r>
+      <w:proofErr w:type="spellStart"/>
+      <w:r>
+        <w:rPr>
+          <w:color w:val="auto"/>
+        </w:rPr>
+        <w:t>NHDPlus</w:t>
+      </w:r>
+      <w:proofErr w:type="spellEnd"/>
+      <w:r>
+        <w:rPr>
+          <w:color w:val="auto"/>
+        </w:rPr>
+        <w:t xml:space="preserve"> HR)</w:t>
       </w:r>
     </w:p>
     <w:p>
@@ -201,7 +262,28 @@
     </w:p>
     <w:p>
       <w:r>
-        <w:t xml:space="preserve">The Bays_Bayous_Lakes boundary layer has undergone several revisions in order to refine the boundaries between </w:t>
+        <w:t xml:space="preserve">The </w:t>
+      </w:r>
+      <w:proofErr w:type="spellStart"/>
+      <w:r>
+        <w:t>Bays_Bayous_</w:t>
+      </w:r>
+      <w:proofErr w:type="gramStart"/>
+      <w:r>
+        <w:t>Lakes</w:t>
+      </w:r>
+      <w:proofErr w:type="spellEnd"/>
+      <w:proofErr w:type="gramEnd"/>
+      <w:r>
+        <w:t xml:space="preserve"> boundary layer has undergone several revisions </w:t>
+      </w:r>
+      <w:proofErr w:type="gramStart"/>
+      <w:r>
+        <w:t>in order to</w:t>
+      </w:r>
+      <w:proofErr w:type="gramEnd"/>
+      <w:r>
+        <w:t xml:space="preserve"> refine the boundaries between </w:t>
       </w:r>
       <w:r>
         <w:t>bayous and main waterbody segments, clarify duplicate names, and address other concerns. The current version (V5) was updated from V4</w:t>
@@ -219,10 +301,26 @@
         </w:numPr>
       </w:pPr>
       <w:r>
-        <w:t xml:space="preserve">Duplicate Sheephead Bayous were found in North bay and East Bay. </w:t>
-      </w:r>
-      <w:r>
-        <w:t xml:space="preserve">The bayou in East Bay and renamed “SheepheadBayou_EastBay” </w:t>
+        <w:t xml:space="preserve">Duplicate Sheephead Bayous were found in </w:t>
+      </w:r>
+      <w:proofErr w:type="gramStart"/>
+      <w:r>
+        <w:t>North bay</w:t>
+      </w:r>
+      <w:proofErr w:type="gramEnd"/>
+      <w:r>
+        <w:t xml:space="preserve"> and East Bay. </w:t>
+      </w:r>
+      <w:r>
+        <w:t>The bayou in East Bay and renamed “</w:t>
+      </w:r>
+      <w:proofErr w:type="spellStart"/>
+      <w:r>
+        <w:t>SheepheadBayou_EastBay</w:t>
+      </w:r>
+      <w:proofErr w:type="spellEnd"/>
+      <w:r>
+        <w:t xml:space="preserve">” </w:t>
       </w:r>
     </w:p>
     <w:p>
@@ -237,7 +335,15 @@
         <w:t>A distinct polygon was created for Parker Bayou</w:t>
       </w:r>
       <w:r>
-        <w:t xml:space="preserve"> in East Bay. Within/adjact to Parker Bayou, a polygon was created for Pratt Bayou</w:t>
+        <w:t xml:space="preserve"> in East Bay. Within/</w:t>
+      </w:r>
+      <w:proofErr w:type="spellStart"/>
+      <w:r>
+        <w:t>adjact</w:t>
+      </w:r>
+      <w:proofErr w:type="spellEnd"/>
+      <w:r>
+        <w:t xml:space="preserve"> to Parker Bayou, a polygon was created for Pratt Bayou</w:t>
       </w:r>
       <w:r>
         <w:t xml:space="preserve">. </w:t>
@@ -254,8 +360,13 @@
       <w:r>
         <w:t>Duplicate Johnson Bayous were found, and the Johnson Bayou located in West Bay was renamed “</w:t>
       </w:r>
-      <w:r>
-        <w:t>JohnsonBayou_WestBay”</w:t>
+      <w:proofErr w:type="spellStart"/>
+      <w:r>
+        <w:t>JohnsonBayou_WestBay</w:t>
+      </w:r>
+      <w:proofErr w:type="spellEnd"/>
+      <w:r>
+        <w:t>”</w:t>
       </w:r>
     </w:p>
     <w:p>
@@ -275,8 +386,13 @@
       <w:r>
         <w:t xml:space="preserve"> was separated from North Bay and identified as </w:t>
       </w:r>
-      <w:r>
-        <w:t>McKitchens Bayou.</w:t>
+      <w:proofErr w:type="spellStart"/>
+      <w:r>
+        <w:t>McKitchens</w:t>
+      </w:r>
+      <w:proofErr w:type="spellEnd"/>
+      <w:r>
+        <w:t xml:space="preserve"> Bayou.</w:t>
       </w:r>
     </w:p>
     <w:p>
@@ -300,7 +416,15 @@
         </w:numPr>
       </w:pPr>
       <w:r>
-        <w:t xml:space="preserve">Portions of North Bay that overlayed </w:t>
+        <w:t xml:space="preserve">Portions of North Bay that </w:t>
+      </w:r>
+      <w:proofErr w:type="gramStart"/>
+      <w:r>
+        <w:t>overlayed</w:t>
+      </w:r>
+      <w:proofErr w:type="gramEnd"/>
+      <w:r>
+        <w:t xml:space="preserve"> </w:t>
       </w:r>
       <w:r>
         <w:t xml:space="preserve">Beatty Bayou were deleted and Beatty Bayou was edited to be its own polygon. </w:t>
@@ -342,7 +466,15 @@
         <w:t>The border between St. Andrew Bay and East Bay was edited to match the boundaries outlined by the Numeric Nutrient Criterion</w:t>
       </w:r>
       <w:r>
-        <w:t>, and as a result Massalina Bayou was reassigned a major segment of St. Andrew Bay</w:t>
+        <w:t xml:space="preserve">, and as a result </w:t>
+      </w:r>
+      <w:proofErr w:type="spellStart"/>
+      <w:r>
+        <w:t>Massalina</w:t>
+      </w:r>
+      <w:proofErr w:type="spellEnd"/>
+      <w:r>
+        <w:t xml:space="preserve"> Bayou was reassigned a major segment of St. Andrew Bay</w:t>
       </w:r>
     </w:p>
     <w:p>
@@ -408,7 +540,15 @@
         </w:numPr>
       </w:pPr>
       <w:r>
-        <w:t>Segments of East Bay were removed from the following bayous and new complete bayou polygons were completed</w:t>
+        <w:t xml:space="preserve">Segments of East Bay were removed from the following </w:t>
+      </w:r>
+      <w:proofErr w:type="gramStart"/>
+      <w:r>
+        <w:t>bayous</w:t>
+      </w:r>
+      <w:proofErr w:type="gramEnd"/>
+      <w:r>
+        <w:t xml:space="preserve"> and new complete bayou polygons were completed</w:t>
       </w:r>
     </w:p>
     <w:p>

</xml_diff>

<commit_message>
updated meta data with v6 info
</commit_message>
<xml_diff>
--- a/Methods/Bays_Bayous_Lakes Boundary Layer Meta Data.docx
+++ b/Methods/Bays_Bayous_Lakes Boundary Layer Meta Data.docx
@@ -6,53 +6,19 @@
       <w:pPr>
         <w:pStyle w:val="Heading1"/>
       </w:pPr>
-      <w:proofErr w:type="spellStart"/>
-      <w:r>
-        <w:t>Bays_Bayous_Lakes</w:t>
-      </w:r>
-      <w:proofErr w:type="spellEnd"/>
-      <w:r>
-        <w:t xml:space="preserve"> Boundary Layer Meta Data</w:t>
-      </w:r>
-    </w:p>
-    <w:p>
-      <w:r>
-        <w:t xml:space="preserve">The </w:t>
-      </w:r>
-      <w:proofErr w:type="spellStart"/>
-      <w:r>
-        <w:t>Bays_Bayous_</w:t>
-      </w:r>
-      <w:proofErr w:type="gramStart"/>
-      <w:r>
-        <w:t>Lakes</w:t>
-      </w:r>
-      <w:proofErr w:type="spellEnd"/>
-      <w:proofErr w:type="gramEnd"/>
-      <w:r>
-        <w:t xml:space="preserve"> boundary layer was created by combining </w:t>
-      </w:r>
-      <w:proofErr w:type="spellStart"/>
-      <w:r>
-        <w:t>NHDPlus</w:t>
-      </w:r>
-      <w:proofErr w:type="spellEnd"/>
-      <w:r>
-        <w:t xml:space="preserve"> HR waterbody features with FDEP Florida Lakes and NNC Estuary Nutrient Regions datasets. Features were merged, dissolved, and edited as necessary to produce a continuous polygon layer representing major bays, bayous, lakes, and estuarine waters within </w:t>
+      <w:r>
+        <w:t>Bays_Bayous_Lakes Boundary Layer Meta Data</w:t>
+      </w:r>
+    </w:p>
+    <w:p>
+      <w:r>
+        <w:t xml:space="preserve">The Bays_Bayous_Lakes boundary layer was created by combining NHDPlus HR waterbody features with FDEP Florida Lakes and NNC Estuary Nutrient Regions datasets. Features were merged, dissolved, and edited as necessary to produce a continuous polygon layer representing major bays, bayous, lakes, and estuarine waters within </w:t>
       </w:r>
       <w:r>
         <w:t>the St. Andrew Bay Watershed</w:t>
       </w:r>
       <w:r>
-        <w:t xml:space="preserve">. The FDEP datasets were used to supplement and refine </w:t>
-      </w:r>
-      <w:proofErr w:type="spellStart"/>
-      <w:r>
-        <w:t>NHDPlus</w:t>
-      </w:r>
-      <w:proofErr w:type="spellEnd"/>
-      <w:r>
-        <w:t xml:space="preserve"> HR waterbody boundaries, particularly for estuarine systems and named lakes not fully represented within the base hydrography dataset.</w:t>
+        <w:t>. The FDEP datasets were used to supplement and refine NHDPlus HR waterbody boundaries, particularly for estuarine systems and named lakes not fully represented within the base hydrography dataset.</w:t>
       </w:r>
       <w:r>
         <w:t xml:space="preserve"> The NNC dataset was used to determine the boundaries for each segment in St. Andrew Bay</w:t>
@@ -92,21 +58,7 @@
         <w:rPr>
           <w:color w:val="auto"/>
         </w:rPr>
-        <w:t>graphy Dataset Plus High Resolution (</w:t>
-      </w:r>
-      <w:proofErr w:type="spellStart"/>
-      <w:r>
-        <w:rPr>
-          <w:color w:val="auto"/>
-        </w:rPr>
-        <w:t>NHDPlus</w:t>
-      </w:r>
-      <w:proofErr w:type="spellEnd"/>
-      <w:r>
-        <w:rPr>
-          <w:color w:val="auto"/>
-        </w:rPr>
-        <w:t xml:space="preserve"> HR)</w:t>
+        <w:t>graphy Dataset Plus High Resolution (NHDPlus HR)</w:t>
       </w:r>
     </w:p>
     <w:p>
@@ -257,36 +209,36 @@
           <w:b/>
           <w:bCs/>
         </w:rPr>
-        <w:t>Current Version: Bays_Bayous_Lakes_V5</w:t>
-      </w:r>
-    </w:p>
-    <w:p>
-      <w:r>
-        <w:t xml:space="preserve">The </w:t>
-      </w:r>
-      <w:proofErr w:type="spellStart"/>
-      <w:r>
-        <w:t>Bays_Bayous_</w:t>
-      </w:r>
-      <w:proofErr w:type="gramStart"/>
-      <w:r>
-        <w:t>Lakes</w:t>
-      </w:r>
-      <w:proofErr w:type="spellEnd"/>
-      <w:proofErr w:type="gramEnd"/>
-      <w:r>
-        <w:t xml:space="preserve"> boundary layer has undergone several revisions </w:t>
-      </w:r>
-      <w:proofErr w:type="gramStart"/>
-      <w:r>
-        <w:t>in order to</w:t>
-      </w:r>
-      <w:proofErr w:type="gramEnd"/>
-      <w:r>
-        <w:t xml:space="preserve"> refine the boundaries between </w:t>
-      </w:r>
-      <w:r>
-        <w:t>bayous and main waterbody segments, clarify duplicate names, and address other concerns. The current version (V5) was updated from V4</w:t>
+        <w:t>Current Version: Bays_Bayous_Lakes_V</w:t>
+      </w:r>
+      <w:r>
+        <w:rPr>
+          <w:b/>
+          <w:bCs/>
+        </w:rPr>
+        <w:t>6</w:t>
+      </w:r>
+    </w:p>
+    <w:p>
+      <w:r>
+        <w:t>Changes from V5: Rename major segment of Massalina Bayou to St. Andrew Bay and split Harrison Bayou from Little Johnson Bayou</w:t>
+      </w:r>
+      <w:r>
+        <w:t>.</w:t>
+      </w:r>
+    </w:p>
+    <w:p>
+      <w:r>
+        <w:t xml:space="preserve">The Bays_Bayous_Lakes boundary layer has undergone several revisions in order to refine the boundaries between </w:t>
+      </w:r>
+      <w:r>
+        <w:t>bayous and main waterbody segments, clarify duplicate names, and address other concerns. The</w:t>
+      </w:r>
+      <w:r>
+        <w:t xml:space="preserve"> previous</w:t>
+      </w:r>
+      <w:r>
+        <w:t xml:space="preserve"> version (V5) was updated from V4</w:t>
       </w:r>
       <w:r>
         <w:t xml:space="preserve"> with the following changes: </w:t>
@@ -301,26 +253,10 @@
         </w:numPr>
       </w:pPr>
       <w:r>
-        <w:t xml:space="preserve">Duplicate Sheephead Bayous were found in </w:t>
-      </w:r>
-      <w:proofErr w:type="gramStart"/>
-      <w:r>
-        <w:t>North bay</w:t>
-      </w:r>
-      <w:proofErr w:type="gramEnd"/>
-      <w:r>
-        <w:t xml:space="preserve"> and East Bay. </w:t>
-      </w:r>
-      <w:r>
-        <w:t>The bayou in East Bay and renamed “</w:t>
-      </w:r>
-      <w:proofErr w:type="spellStart"/>
-      <w:r>
-        <w:t>SheepheadBayou_EastBay</w:t>
-      </w:r>
-      <w:proofErr w:type="spellEnd"/>
-      <w:r>
-        <w:t xml:space="preserve">” </w:t>
+        <w:t xml:space="preserve">Duplicate Sheephead Bayous were found in North bay and East Bay. </w:t>
+      </w:r>
+      <w:r>
+        <w:t xml:space="preserve">The bayou in East Bay and renamed “SheepheadBayou_EastBay” </w:t>
       </w:r>
     </w:p>
     <w:p>
@@ -335,15 +271,7 @@
         <w:t>A distinct polygon was created for Parker Bayou</w:t>
       </w:r>
       <w:r>
-        <w:t xml:space="preserve"> in East Bay. Within/</w:t>
-      </w:r>
-      <w:proofErr w:type="spellStart"/>
-      <w:r>
-        <w:t>adjact</w:t>
-      </w:r>
-      <w:proofErr w:type="spellEnd"/>
-      <w:r>
-        <w:t xml:space="preserve"> to Parker Bayou, a polygon was created for Pratt Bayou</w:t>
+        <w:t xml:space="preserve"> in East Bay. Within/adjact to Parker Bayou, a polygon was created for Pratt Bayou</w:t>
       </w:r>
       <w:r>
         <w:t xml:space="preserve">. </w:t>
@@ -360,13 +288,8 @@
       <w:r>
         <w:t>Duplicate Johnson Bayous were found, and the Johnson Bayou located in West Bay was renamed “</w:t>
       </w:r>
-      <w:proofErr w:type="spellStart"/>
-      <w:r>
-        <w:t>JohnsonBayou_WestBay</w:t>
-      </w:r>
-      <w:proofErr w:type="spellEnd"/>
-      <w:r>
-        <w:t>”</w:t>
+      <w:r>
+        <w:t>JohnsonBayou_WestBay”</w:t>
       </w:r>
     </w:p>
     <w:p>
@@ -386,13 +309,8 @@
       <w:r>
         <w:t xml:space="preserve"> was separated from North Bay and identified as </w:t>
       </w:r>
-      <w:proofErr w:type="spellStart"/>
-      <w:r>
-        <w:t>McKitchens</w:t>
-      </w:r>
-      <w:proofErr w:type="spellEnd"/>
-      <w:r>
-        <w:t xml:space="preserve"> Bayou.</w:t>
+      <w:r>
+        <w:t>McKitchens Bayou.</w:t>
       </w:r>
     </w:p>
     <w:p>
@@ -416,15 +334,7 @@
         </w:numPr>
       </w:pPr>
       <w:r>
-        <w:t xml:space="preserve">Portions of North Bay that </w:t>
-      </w:r>
-      <w:proofErr w:type="gramStart"/>
-      <w:r>
-        <w:t>overlayed</w:t>
-      </w:r>
-      <w:proofErr w:type="gramEnd"/>
-      <w:r>
-        <w:t xml:space="preserve"> </w:t>
+        <w:t xml:space="preserve">Portions of North Bay that overlayed </w:t>
       </w:r>
       <w:r>
         <w:t xml:space="preserve">Beatty Bayou were deleted and Beatty Bayou was edited to be its own polygon. </w:t>
@@ -466,15 +376,7 @@
         <w:t>The border between St. Andrew Bay and East Bay was edited to match the boundaries outlined by the Numeric Nutrient Criterion</w:t>
       </w:r>
       <w:r>
-        <w:t xml:space="preserve">, and as a result </w:t>
-      </w:r>
-      <w:proofErr w:type="spellStart"/>
-      <w:r>
-        <w:t>Massalina</w:t>
-      </w:r>
-      <w:proofErr w:type="spellEnd"/>
-      <w:r>
-        <w:t xml:space="preserve"> Bayou was reassigned a major segment of St. Andrew Bay</w:t>
+        <w:t>, and as a result Massalina Bayou was reassigned a major segment of St. Andrew Bay</w:t>
       </w:r>
     </w:p>
     <w:p>
@@ -540,15 +442,7 @@
         </w:numPr>
       </w:pPr>
       <w:r>
-        <w:t xml:space="preserve">Segments of East Bay were removed from the following </w:t>
-      </w:r>
-      <w:proofErr w:type="gramStart"/>
-      <w:r>
-        <w:t>bayous</w:t>
-      </w:r>
-      <w:proofErr w:type="gramEnd"/>
-      <w:r>
-        <w:t xml:space="preserve"> and new complete bayou polygons were completed</w:t>
+        <w:t>Segments of East Bay were removed from the following bayous and new complete bayou polygons were completed</w:t>
       </w:r>
     </w:p>
     <w:p>
@@ -596,6 +490,7 @@
         </w:numPr>
       </w:pPr>
       <w:r>
+        <w:lastRenderedPageBreak/>
         <w:t>Bur</w:t>
       </w:r>
       <w:r>
@@ -623,7 +518,6 @@
         </w:numPr>
       </w:pPr>
       <w:r>
-        <w:lastRenderedPageBreak/>
         <w:t>Little Blue Lake</w:t>
       </w:r>
     </w:p>

</xml_diff>